<commit_message>
docs: v2.1 배포 준비 — requirements/BUILD_GUIDE/DEV_LOG 업데이트
- requirements-build.txt: PyInstaller 6.1.0 → 6.19.0, pytest 9.0.3 추가
- BUILD_GUIDE.md: PyInstaller 버전, EXE 크기(~1.2GB), 날짜/버전(2.1) 갱신
- DEV_LOG.md: v2.1 작업 이력 추가 (상수화/함수분해/타입힌팅/멀티프로세싱/ImageCache/테스트)
- .gitignore: 금형이력카드프로그램_v2.1/ 배포 스테이징 폴더 제외 추가
- config.yaml, main.py, Word 템플릿 변경사항 포함

Co-Authored-By: Claude Sonnet 4.6 <noreply@anthropic.com>
</commit_message>
<xml_diff>
--- a/data/templates/Word_양식.docx
+++ b/data/templates/Word_양식.docx
@@ -3917,10 +3917,190 @@
         <mc:AlternateContent>
           <mc:Choice Requires="wps">
             <w:drawing>
+              <wp:anchor distT="0" distB="0" distL="114300" distR="114300" simplePos="0" relativeHeight="251660288" behindDoc="0" locked="0" layoutInCell="1" allowOverlap="1" wp14:anchorId="5AE15CFC" wp14:editId="12B91886">
+                <wp:simplePos x="0" y="0"/>
+                <wp:positionH relativeFrom="column">
+                  <wp:posOffset>2156773</wp:posOffset>
+                </wp:positionH>
+                <wp:positionV relativeFrom="paragraph">
+                  <wp:posOffset>7949565</wp:posOffset>
+                </wp:positionV>
+                <wp:extent cx="2579370" cy="752475"/>
+                <wp:effectExtent l="0" t="0" r="11430" b="28575"/>
+                <wp:wrapNone/>
+                <wp:docPr id="3" name="직사각형 3"/>
+                <wp:cNvGraphicFramePr/>
+                <a:graphic xmlns:a="http://schemas.openxmlformats.org/drawingml/2006/main">
+                  <a:graphicData uri="http://schemas.microsoft.com/office/word/2010/wordprocessingShape">
+                    <wps:wsp>
+                      <wps:cNvSpPr/>
+                      <wps:spPr>
+                        <a:xfrm>
+                          <a:off x="0" y="0"/>
+                          <a:ext cx="2579370" cy="752475"/>
+                        </a:xfrm>
+                        <a:prstGeom prst="rect">
+                          <a:avLst/>
+                        </a:prstGeom>
+                        <a:noFill/>
+                        <a:ln>
+                          <a:solidFill>
+                            <a:schemeClr val="tx1"/>
+                          </a:solidFill>
+                        </a:ln>
+                        <a:effectLst/>
+                      </wps:spPr>
+                      <wps:style>
+                        <a:lnRef idx="1">
+                          <a:schemeClr val="accent1"/>
+                        </a:lnRef>
+                        <a:fillRef idx="3">
+                          <a:schemeClr val="accent1"/>
+                        </a:fillRef>
+                        <a:effectRef idx="2">
+                          <a:schemeClr val="accent1"/>
+                        </a:effectRef>
+                        <a:fontRef idx="minor">
+                          <a:schemeClr val="lt1"/>
+                        </a:fontRef>
+                      </wps:style>
+                      <wps:txbx>
+                        <w:txbxContent>
+                          <w:p>
+                            <w:pPr>
+                              <w:pStyle w:val="MS"/>
+                              <w:spacing w:after="0" w:line="240" w:lineRule="auto"/>
+                              <w:jc w:val="center"/>
+                              <w:rPr>
+                                <w:rFonts w:asciiTheme="majorEastAsia" w:eastAsiaTheme="majorEastAsia" w:hAnsiTheme="majorEastAsia"/>
+                                <w:b/>
+                                <w:bCs/>
+                                <w:sz w:val="60"/>
+                                <w:szCs w:val="60"/>
+                              </w:rPr>
+                            </w:pPr>
+                            <w:r>
+                              <w:rPr>
+                                <w:rFonts w:asciiTheme="majorEastAsia" w:eastAsiaTheme="majorEastAsia" w:hAnsiTheme="majorEastAsia" w:hint="eastAsia"/>
+                                <w:b/>
+                                <w:bCs/>
+                                <w:sz w:val="60"/>
+                                <w:szCs w:val="60"/>
+                              </w:rPr>
+                              <w:t>韓</w:t>
+                            </w:r>
+                            <w:r>
+                              <w:rPr>
+                                <w:rFonts w:asciiTheme="majorEastAsia" w:eastAsiaTheme="majorEastAsia" w:hAnsiTheme="majorEastAsia" w:cs="새굴림" w:hint="eastAsia"/>
+                                <w:b/>
+                                <w:bCs/>
+                                <w:sz w:val="60"/>
+                                <w:szCs w:val="60"/>
+                              </w:rPr>
+                              <w:t>国</w:t>
+                            </w:r>
+                            <w:r>
+                              <w:rPr>
+                                <w:rFonts w:asciiTheme="majorEastAsia" w:eastAsiaTheme="majorEastAsia" w:hAnsiTheme="majorEastAsia" w:hint="eastAsia"/>
+                                <w:b/>
+                                <w:bCs/>
+                                <w:sz w:val="60"/>
+                                <w:szCs w:val="60"/>
+                              </w:rPr>
+                              <w:t xml:space="preserve"> A&amp;D</w:t>
+                            </w:r>
+                          </w:p>
+                        </w:txbxContent>
+                      </wps:txbx>
+                      <wps:bodyPr rot="0" spcFirstLastPara="0" vertOverflow="overflow" horzOverflow="overflow" vert="horz" wrap="square" lIns="91440" tIns="45720" rIns="91440" bIns="45720" numCol="1" spcCol="0" rtlCol="0" fromWordArt="0" anchor="ctr" anchorCtr="0" forceAA="0" compatLnSpc="1">
+                        <a:prstTxWarp prst="textNoShape">
+                          <a:avLst/>
+                        </a:prstTxWarp>
+                        <a:noAutofit/>
+                      </wps:bodyPr>
+                    </wps:wsp>
+                  </a:graphicData>
+                </a:graphic>
+                <wp14:sizeRelH relativeFrom="margin">
+                  <wp14:pctWidth>0</wp14:pctWidth>
+                </wp14:sizeRelH>
+                <wp14:sizeRelV relativeFrom="margin">
+                  <wp14:pctHeight>0</wp14:pctHeight>
+                </wp14:sizeRelV>
+              </wp:anchor>
+            </w:drawing>
+          </mc:Choice>
+          <mc:Fallback>
+            <w:pict>
+              <v:rect w14:anchorId="5AE15CFC" id="직사각형 3" o:spid="_x0000_s1026" style="position:absolute;margin-left:169.8pt;margin-top:625.95pt;width:203.1pt;height:59.25pt;z-index:251660288;visibility:visible;mso-wrap-style:square;mso-width-percent:0;mso-height-percent:0;mso-wrap-distance-left:9pt;mso-wrap-distance-top:0;mso-wrap-distance-right:9pt;mso-wrap-distance-bottom:0;mso-position-horizontal:absolute;mso-position-horizontal-relative:text;mso-position-vertical:absolute;mso-position-vertical-relative:text;mso-width-percent:0;mso-height-percent:0;mso-width-relative:margin;mso-height-relative:margin;v-text-anchor:middle" o:gfxdata="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" filled="f" strokecolor="black [3213]" strokeweight=".5pt">
+                <v:textbox>
+                  <w:txbxContent>
+                    <w:p>
+                      <w:pPr>
+                        <w:pStyle w:val="MS"/>
+                        <w:spacing w:after="0" w:line="240" w:lineRule="auto"/>
+                        <w:jc w:val="center"/>
+                        <w:rPr>
+                          <w:rFonts w:asciiTheme="majorEastAsia" w:eastAsiaTheme="majorEastAsia" w:hAnsiTheme="majorEastAsia"/>
+                          <w:b/>
+                          <w:bCs/>
+                          <w:sz w:val="60"/>
+                          <w:szCs w:val="60"/>
+                        </w:rPr>
+                      </w:pPr>
+                      <w:r>
+                        <w:rPr>
+                          <w:rFonts w:asciiTheme="majorEastAsia" w:eastAsiaTheme="majorEastAsia" w:hAnsiTheme="majorEastAsia" w:hint="eastAsia"/>
+                          <w:b/>
+                          <w:bCs/>
+                          <w:sz w:val="60"/>
+                          <w:szCs w:val="60"/>
+                        </w:rPr>
+                        <w:t>韓</w:t>
+                      </w:r>
+                      <w:r>
+                        <w:rPr>
+                          <w:rFonts w:asciiTheme="majorEastAsia" w:eastAsiaTheme="majorEastAsia" w:hAnsiTheme="majorEastAsia" w:cs="새굴림" w:hint="eastAsia"/>
+                          <w:b/>
+                          <w:bCs/>
+                          <w:sz w:val="60"/>
+                          <w:szCs w:val="60"/>
+                        </w:rPr>
+                        <w:t>国</w:t>
+                      </w:r>
+                      <w:r>
+                        <w:rPr>
+                          <w:rFonts w:asciiTheme="majorEastAsia" w:eastAsiaTheme="majorEastAsia" w:hAnsiTheme="majorEastAsia" w:hint="eastAsia"/>
+                          <w:b/>
+                          <w:bCs/>
+                          <w:sz w:val="60"/>
+                          <w:szCs w:val="60"/>
+                        </w:rPr>
+                        <w:t xml:space="preserve"> A&amp;D</w:t>
+                      </w:r>
+                    </w:p>
+                  </w:txbxContent>
+                </v:textbox>
+              </v:rect>
+            </w:pict>
+          </mc:Fallback>
+        </mc:AlternateContent>
+      </w:r>
+      <w:r>
+        <w:rPr>
+          <w:rFonts w:eastAsia="맑은 고딕"/>
+          <w:b/>
+          <w:noProof/>
+          <w:sz w:val="26"/>
+          <w:lang w:eastAsia="ko-KR"/>
+        </w:rPr>
+        <mc:AlternateContent>
+          <mc:Choice Requires="wps">
+            <w:drawing>
               <wp:anchor distT="0" distB="0" distL="114300" distR="114300" simplePos="0" relativeHeight="251661312" behindDoc="0" locked="0" layoutInCell="1" allowOverlap="1" wp14:anchorId="1C94731F" wp14:editId="061125BC">
                 <wp:simplePos x="0" y="0"/>
                 <wp:positionH relativeFrom="column">
-                  <wp:posOffset>1125855</wp:posOffset>
+                  <wp:posOffset>1246183</wp:posOffset>
                 </wp:positionH>
                 <wp:positionV relativeFrom="paragraph">
                   <wp:posOffset>2244090</wp:posOffset>
@@ -4032,7 +4212,7 @@
           </mc:Choice>
           <mc:Fallback>
             <w:pict>
-              <v:rect w14:anchorId="1C94731F" id="직사각형 4" o:spid="_x0000_s1026" style="position:absolute;margin-left:88.65pt;margin-top:176.7pt;width:355.75pt;height:69.75pt;z-index:251661312;visibility:visible;mso-wrap-style:square;mso-width-percent:0;mso-height-percent:0;mso-wrap-distance-left:9pt;mso-wrap-distance-top:0;mso-wrap-distance-right:9pt;mso-wrap-distance-bottom:0;mso-position-horizontal:absolute;mso-position-horizontal-relative:text;mso-position-vertical:absolute;mso-position-vertical-relative:text;mso-width-percent:0;mso-height-percent:0;mso-width-relative:margin;mso-height-relative:margin;v-text-anchor:middle" o:gfxdata="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" filled="f" strokecolor="black [3213]" strokeweight=".5pt">
+              <v:rect w14:anchorId="1C94731F" id="직사각형 4" o:spid="_x0000_s1027" style="position:absolute;margin-left:98.1pt;margin-top:176.7pt;width:355.75pt;height:69.75pt;z-index:251661312;visibility:visible;mso-wrap-style:square;mso-width-percent:0;mso-height-percent:0;mso-wrap-distance-left:9pt;mso-wrap-distance-top:0;mso-wrap-distance-right:9pt;mso-wrap-distance-bottom:0;mso-position-horizontal:absolute;mso-position-horizontal-relative:text;mso-position-vertical:absolute;mso-position-vertical-relative:text;mso-width-percent:0;mso-height-percent:0;mso-width-relative:margin;mso-height-relative:margin;v-text-anchor:middle" o:gfxdata="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" filled="f" strokecolor="black [3213]" strokeweight=".5pt">
                 <v:textbox>
                   <w:txbxContent>
                     <w:p>
@@ -4077,186 +4257,6 @@
                           <w:szCs w:val="64"/>
                         </w:rPr>
                         <w:t>確認書</w:t>
-                      </w:r>
-                    </w:p>
-                  </w:txbxContent>
-                </v:textbox>
-              </v:rect>
-            </w:pict>
-          </mc:Fallback>
-        </mc:AlternateContent>
-      </w:r>
-      <w:r>
-        <w:rPr>
-          <w:rFonts w:eastAsia="맑은 고딕"/>
-          <w:b/>
-          <w:noProof/>
-          <w:sz w:val="26"/>
-          <w:lang w:eastAsia="ko-KR"/>
-        </w:rPr>
-        <mc:AlternateContent>
-          <mc:Choice Requires="wps">
-            <w:drawing>
-              <wp:anchor distT="0" distB="0" distL="114300" distR="114300" simplePos="0" relativeHeight="251660288" behindDoc="0" locked="0" layoutInCell="1" allowOverlap="1" wp14:anchorId="5AE15CFC" wp14:editId="12B91886">
-                <wp:simplePos x="0" y="0"/>
-                <wp:positionH relativeFrom="column">
-                  <wp:posOffset>2116455</wp:posOffset>
-                </wp:positionH>
-                <wp:positionV relativeFrom="paragraph">
-                  <wp:posOffset>7949565</wp:posOffset>
-                </wp:positionV>
-                <wp:extent cx="2579914" cy="752475"/>
-                <wp:effectExtent l="0" t="0" r="11430" b="28575"/>
-                <wp:wrapNone/>
-                <wp:docPr id="3" name="직사각형 3"/>
-                <wp:cNvGraphicFramePr/>
-                <a:graphic xmlns:a="http://schemas.openxmlformats.org/drawingml/2006/main">
-                  <a:graphicData uri="http://schemas.microsoft.com/office/word/2010/wordprocessingShape">
-                    <wps:wsp>
-                      <wps:cNvSpPr/>
-                      <wps:spPr>
-                        <a:xfrm>
-                          <a:off x="0" y="0"/>
-                          <a:ext cx="2579914" cy="752475"/>
-                        </a:xfrm>
-                        <a:prstGeom prst="rect">
-                          <a:avLst/>
-                        </a:prstGeom>
-                        <a:noFill/>
-                        <a:ln>
-                          <a:solidFill>
-                            <a:schemeClr val="tx1"/>
-                          </a:solidFill>
-                        </a:ln>
-                        <a:effectLst/>
-                      </wps:spPr>
-                      <wps:style>
-                        <a:lnRef idx="1">
-                          <a:schemeClr val="accent1"/>
-                        </a:lnRef>
-                        <a:fillRef idx="3">
-                          <a:schemeClr val="accent1"/>
-                        </a:fillRef>
-                        <a:effectRef idx="2">
-                          <a:schemeClr val="accent1"/>
-                        </a:effectRef>
-                        <a:fontRef idx="minor">
-                          <a:schemeClr val="lt1"/>
-                        </a:fontRef>
-                      </wps:style>
-                      <wps:txbx>
-                        <w:txbxContent>
-                          <w:p>
-                            <w:pPr>
-                              <w:pStyle w:val="MS"/>
-                              <w:spacing w:after="0" w:line="240" w:lineRule="auto"/>
-                              <w:jc w:val="center"/>
-                              <w:rPr>
-                                <w:rFonts w:asciiTheme="majorEastAsia" w:eastAsiaTheme="majorEastAsia" w:hAnsiTheme="majorEastAsia"/>
-                                <w:b/>
-                                <w:bCs/>
-                                <w:sz w:val="60"/>
-                                <w:szCs w:val="60"/>
-                              </w:rPr>
-                            </w:pPr>
-                            <w:r>
-                              <w:rPr>
-                                <w:rFonts w:asciiTheme="majorEastAsia" w:eastAsiaTheme="majorEastAsia" w:hAnsiTheme="majorEastAsia" w:hint="eastAsia"/>
-                                <w:b/>
-                                <w:bCs/>
-                                <w:sz w:val="60"/>
-                                <w:szCs w:val="60"/>
-                              </w:rPr>
-                              <w:t>韓</w:t>
-                            </w:r>
-                            <w:r>
-                              <w:rPr>
-                                <w:rFonts w:asciiTheme="majorEastAsia" w:eastAsiaTheme="majorEastAsia" w:hAnsiTheme="majorEastAsia" w:cs="새굴림" w:hint="eastAsia"/>
-                                <w:b/>
-                                <w:bCs/>
-                                <w:sz w:val="60"/>
-                                <w:szCs w:val="60"/>
-                              </w:rPr>
-                              <w:t>国</w:t>
-                            </w:r>
-                            <w:r>
-                              <w:rPr>
-                                <w:rFonts w:asciiTheme="majorEastAsia" w:eastAsiaTheme="majorEastAsia" w:hAnsiTheme="majorEastAsia" w:hint="eastAsia"/>
-                                <w:b/>
-                                <w:bCs/>
-                                <w:sz w:val="60"/>
-                                <w:szCs w:val="60"/>
-                              </w:rPr>
-                              <w:t xml:space="preserve"> A&amp;D</w:t>
-                            </w:r>
-                          </w:p>
-                        </w:txbxContent>
-                      </wps:txbx>
-                      <wps:bodyPr rot="0" spcFirstLastPara="0" vertOverflow="overflow" horzOverflow="overflow" vert="horz" wrap="square" lIns="91440" tIns="45720" rIns="91440" bIns="45720" numCol="1" spcCol="0" rtlCol="0" fromWordArt="0" anchor="ctr" anchorCtr="0" forceAA="0" compatLnSpc="1">
-                        <a:prstTxWarp prst="textNoShape">
-                          <a:avLst/>
-                        </a:prstTxWarp>
-                        <a:noAutofit/>
-                      </wps:bodyPr>
-                    </wps:wsp>
-                  </a:graphicData>
-                </a:graphic>
-                <wp14:sizeRelH relativeFrom="margin">
-                  <wp14:pctWidth>0</wp14:pctWidth>
-                </wp14:sizeRelH>
-                <wp14:sizeRelV relativeFrom="margin">
-                  <wp14:pctHeight>0</wp14:pctHeight>
-                </wp14:sizeRelV>
-              </wp:anchor>
-            </w:drawing>
-          </mc:Choice>
-          <mc:Fallback>
-            <w:pict>
-              <v:rect w14:anchorId="5AE15CFC" id="직사각형 3" o:spid="_x0000_s1027" style="position:absolute;margin-left:166.65pt;margin-top:625.95pt;width:203.15pt;height:59.25pt;z-index:251660288;visibility:visible;mso-wrap-style:square;mso-width-percent:0;mso-height-percent:0;mso-wrap-distance-left:9pt;mso-wrap-distance-top:0;mso-wrap-distance-right:9pt;mso-wrap-distance-bottom:0;mso-position-horizontal:absolute;mso-position-horizontal-relative:text;mso-position-vertical:absolute;mso-position-vertical-relative:text;mso-width-percent:0;mso-height-percent:0;mso-width-relative:margin;mso-height-relative:margin;v-text-anchor:middle" o:gfxdata="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" filled="f" strokecolor="black [3213]" strokeweight=".5pt">
-                <v:textbox>
-                  <w:txbxContent>
-                    <w:p>
-                      <w:pPr>
-                        <w:pStyle w:val="MS"/>
-                        <w:spacing w:after="0" w:line="240" w:lineRule="auto"/>
-                        <w:jc w:val="center"/>
-                        <w:rPr>
-                          <w:rFonts w:asciiTheme="majorEastAsia" w:eastAsiaTheme="majorEastAsia" w:hAnsiTheme="majorEastAsia"/>
-                          <w:b/>
-                          <w:bCs/>
-                          <w:sz w:val="60"/>
-                          <w:szCs w:val="60"/>
-                        </w:rPr>
-                      </w:pPr>
-                      <w:r>
-                        <w:rPr>
-                          <w:rFonts w:asciiTheme="majorEastAsia" w:eastAsiaTheme="majorEastAsia" w:hAnsiTheme="majorEastAsia" w:hint="eastAsia"/>
-                          <w:b/>
-                          <w:bCs/>
-                          <w:sz w:val="60"/>
-                          <w:szCs w:val="60"/>
-                        </w:rPr>
-                        <w:t>韓</w:t>
-                      </w:r>
-                      <w:r>
-                        <w:rPr>
-                          <w:rFonts w:asciiTheme="majorEastAsia" w:eastAsiaTheme="majorEastAsia" w:hAnsiTheme="majorEastAsia" w:cs="새굴림" w:hint="eastAsia"/>
-                          <w:b/>
-                          <w:bCs/>
-                          <w:sz w:val="60"/>
-                          <w:szCs w:val="60"/>
-                        </w:rPr>
-                        <w:t>国</w:t>
-                      </w:r>
-                      <w:r>
-                        <w:rPr>
-                          <w:rFonts w:asciiTheme="majorEastAsia" w:eastAsiaTheme="majorEastAsia" w:hAnsiTheme="majorEastAsia" w:hint="eastAsia"/>
-                          <w:b/>
-                          <w:bCs/>
-                          <w:sz w:val="60"/>
-                          <w:szCs w:val="60"/>
-                        </w:rPr>
-                        <w:t xml:space="preserve"> A&amp;D</w:t>
                       </w:r>
                     </w:p>
                   </w:txbxContent>
@@ -4340,8 +4340,8 @@
                                   <w:tcW w:w="534" w:type="dxa"/>
                                   <w:vMerge w:val="restart"/>
                                   <w:tcBorders>
-                                    <w:top w:val="single" w:sz="8" w:space="0" w:color="000000"/>
-                                    <w:left w:val="single" w:sz="8" w:space="0" w:color="000000"/>
+                                    <w:top w:val="single" w:sz="4" w:space="0" w:color="auto"/>
+                                    <w:left w:val="single" w:sz="4" w:space="0" w:color="auto"/>
                                     <w:bottom w:val="single" w:sz="8" w:space="0" w:color="000000"/>
                                     <w:right w:val="single" w:sz="4" w:space="0" w:color="000000"/>
                                   </w:tcBorders>
@@ -4369,7 +4369,7 @@
                                 <w:tcPr>
                                   <w:tcW w:w="708" w:type="dxa"/>
                                   <w:tcBorders>
-                                    <w:top w:val="single" w:sz="8" w:space="0" w:color="000000"/>
+                                    <w:top w:val="single" w:sz="4" w:space="0" w:color="auto"/>
                                     <w:left w:val="single" w:sz="4" w:space="0" w:color="000000"/>
                                     <w:bottom w:val="single" w:sz="4" w:space="0" w:color="000000"/>
                                     <w:right w:val="single" w:sz="4" w:space="0" w:color="000000"/>
@@ -4402,7 +4402,7 @@
                                 <w:tcPr>
                                   <w:tcW w:w="1760" w:type="dxa"/>
                                   <w:tcBorders>
-                                    <w:top w:val="single" w:sz="8" w:space="0" w:color="000000"/>
+                                    <w:top w:val="single" w:sz="4" w:space="0" w:color="auto"/>
                                     <w:left w:val="single" w:sz="4" w:space="0" w:color="000000"/>
                                     <w:bottom w:val="single" w:sz="4" w:space="0" w:color="000000"/>
                                     <w:right w:val="single" w:sz="4" w:space="0" w:color="000000"/>
@@ -4433,10 +4433,10 @@
                                 <w:tcPr>
                                   <w:tcW w:w="1760" w:type="dxa"/>
                                   <w:tcBorders>
-                                    <w:top w:val="single" w:sz="8" w:space="0" w:color="000000"/>
+                                    <w:top w:val="single" w:sz="4" w:space="0" w:color="auto"/>
                                     <w:left w:val="single" w:sz="4" w:space="0" w:color="000000"/>
                                     <w:bottom w:val="single" w:sz="4" w:space="0" w:color="000000"/>
-                                    <w:right w:val="single" w:sz="8" w:space="0" w:color="000000"/>
+                                    <w:right w:val="single" w:sz="4" w:space="0" w:color="auto"/>
                                   </w:tcBorders>
                                   <w:vAlign w:val="center"/>
                                 </w:tcPr>
@@ -4540,7 +4540,7 @@
                                     <w:top w:val="single" w:sz="4" w:space="0" w:color="000000"/>
                                     <w:left w:val="single" w:sz="4" w:space="0" w:color="000000"/>
                                     <w:bottom w:val="single" w:sz="4" w:space="0" w:color="000000"/>
-                                    <w:right w:val="single" w:sz="8" w:space="0" w:color="000000"/>
+                                    <w:right w:val="single" w:sz="4" w:space="0" w:color="auto"/>
                                   </w:tcBorders>
                                   <w:vAlign w:val="center"/>
                                 </w:tcPr>
@@ -4565,6 +4565,9 @@
                                 <w:tcPr>
                                   <w:tcW w:w="534" w:type="dxa"/>
                                   <w:vMerge/>
+                                  <w:tcBorders>
+                                    <w:bottom w:val="single" w:sz="4" w:space="0" w:color="auto"/>
+                                  </w:tcBorders>
                                   <w:vAlign w:val="center"/>
                                 </w:tcPr>
                                 <w:p>
@@ -4579,7 +4582,7 @@
                                   <w:tcBorders>
                                     <w:top w:val="single" w:sz="4" w:space="0" w:color="000000"/>
                                     <w:left w:val="single" w:sz="4" w:space="0" w:color="000000"/>
-                                    <w:bottom w:val="single" w:sz="8" w:space="0" w:color="000000"/>
+                                    <w:bottom w:val="single" w:sz="4" w:space="0" w:color="auto"/>
                                     <w:right w:val="single" w:sz="4" w:space="0" w:color="000000"/>
                                   </w:tcBorders>
                                   <w:vAlign w:val="center"/>
@@ -4612,7 +4615,7 @@
                                   <w:tcBorders>
                                     <w:top w:val="single" w:sz="4" w:space="0" w:color="000000"/>
                                     <w:left w:val="single" w:sz="4" w:space="0" w:color="000000"/>
-                                    <w:bottom w:val="single" w:sz="8" w:space="0" w:color="000000"/>
+                                    <w:bottom w:val="single" w:sz="4" w:space="0" w:color="auto"/>
                                     <w:right w:val="single" w:sz="4" w:space="0" w:color="000000"/>
                                   </w:tcBorders>
                                   <w:vAlign w:val="center"/>
@@ -4635,8 +4638,8 @@
                                   <w:tcBorders>
                                     <w:top w:val="single" w:sz="4" w:space="0" w:color="000000"/>
                                     <w:left w:val="single" w:sz="4" w:space="0" w:color="000000"/>
-                                    <w:bottom w:val="single" w:sz="8" w:space="0" w:color="000000"/>
-                                    <w:right w:val="single" w:sz="8" w:space="0" w:color="000000"/>
+                                    <w:bottom w:val="single" w:sz="4" w:space="0" w:color="auto"/>
+                                    <w:right w:val="single" w:sz="4" w:space="0" w:color="auto"/>
                                   </w:tcBorders>
                                   <w:vAlign w:val="center"/>
                                 </w:tcPr>
@@ -4749,6 +4752,8 @@
                                 <w:sz w:val="32"/>
                               </w:rPr>
                             </w:pPr>
+                            <w:bookmarkStart w:id="0" w:name="_GoBack"/>
+                            <w:bookmarkEnd w:id="0"/>
                           </w:p>
                           <w:p>
                             <w:pPr>
@@ -4908,7 +4913,7 @@
                           </w:p>
                         </w:txbxContent>
                       </wps:txbx>
-                      <wps:bodyPr rot="0" spcFirstLastPara="0" vertOverflow="overflow" horzOverflow="overflow" vert="horz" wrap="square" lIns="91440" tIns="45720" rIns="91440" bIns="45720" numCol="1" spcCol="0" rtlCol="0" fromWordArt="0" anchor="ctr" anchorCtr="0" forceAA="0" compatLnSpc="1">
+                      <wps:bodyPr rot="0" spcFirstLastPara="0" vertOverflow="overflow" horzOverflow="overflow" vert="horz" wrap="square" lIns="0" tIns="0" rIns="0" bIns="0" numCol="1" spcCol="0" rtlCol="0" fromWordArt="0" anchor="ctr" anchorCtr="0" forceAA="0" compatLnSpc="1">
                         <a:prstTxWarp prst="textNoShape">
                           <a:avLst/>
                         </a:prstTxWarp>
@@ -4922,8 +4927,8 @@
           </mc:Choice>
           <mc:Fallback>
             <w:pict>
-              <v:rect w14:anchorId="61EE9283" id="직사각형 5" o:spid="_x0000_s1028" style="width:533.25pt;height:768.55pt;visibility:visible;mso-wrap-style:square;mso-left-percent:-10001;mso-top-percent:-10001;mso-position-horizontal:absolute;mso-position-horizontal-relative:char;mso-position-vertical:absolute;mso-position-vertical-relative:line;mso-left-percent:-10001;mso-top-percent:-10001;v-text-anchor:middle" o:gfxdata="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" filled="f" strokecolor="black [3213]" strokeweight="1.5pt">
-                <v:textbox>
+              <v:rect w14:anchorId="61EE9283" id="직사각형 5" o:spid="_x0000_s1028" style="width:533.25pt;height:768.55pt;visibility:visible;mso-wrap-style:square;mso-left-percent:-10001;mso-top-percent:-10001;mso-position-horizontal:absolute;mso-position-horizontal-relative:char;mso-position-vertical:absolute;mso-position-vertical-relative:line;mso-left-percent:-10001;mso-top-percent:-10001;v-text-anchor:middle" o:gfxdata="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" filled="f" strokecolor="black [3213]" strokeweight="1.5pt">
+                <v:textbox inset="0,0,0,0">
                   <w:txbxContent>
                     <w:tbl>
                       <w:tblPr>
@@ -4947,8 +4952,8 @@
                             <w:tcW w:w="534" w:type="dxa"/>
                             <w:vMerge w:val="restart"/>
                             <w:tcBorders>
-                              <w:top w:val="single" w:sz="8" w:space="0" w:color="000000"/>
-                              <w:left w:val="single" w:sz="8" w:space="0" w:color="000000"/>
+                              <w:top w:val="single" w:sz="4" w:space="0" w:color="auto"/>
+                              <w:left w:val="single" w:sz="4" w:space="0" w:color="auto"/>
                               <w:bottom w:val="single" w:sz="8" w:space="0" w:color="000000"/>
                               <w:right w:val="single" w:sz="4" w:space="0" w:color="000000"/>
                             </w:tcBorders>
@@ -4976,7 +4981,7 @@
                           <w:tcPr>
                             <w:tcW w:w="708" w:type="dxa"/>
                             <w:tcBorders>
-                              <w:top w:val="single" w:sz="8" w:space="0" w:color="000000"/>
+                              <w:top w:val="single" w:sz="4" w:space="0" w:color="auto"/>
                               <w:left w:val="single" w:sz="4" w:space="0" w:color="000000"/>
                               <w:bottom w:val="single" w:sz="4" w:space="0" w:color="000000"/>
                               <w:right w:val="single" w:sz="4" w:space="0" w:color="000000"/>
@@ -5009,7 +5014,7 @@
                           <w:tcPr>
                             <w:tcW w:w="1760" w:type="dxa"/>
                             <w:tcBorders>
-                              <w:top w:val="single" w:sz="8" w:space="0" w:color="000000"/>
+                              <w:top w:val="single" w:sz="4" w:space="0" w:color="auto"/>
                               <w:left w:val="single" w:sz="4" w:space="0" w:color="000000"/>
                               <w:bottom w:val="single" w:sz="4" w:space="0" w:color="000000"/>
                               <w:right w:val="single" w:sz="4" w:space="0" w:color="000000"/>
@@ -5040,10 +5045,10 @@
                           <w:tcPr>
                             <w:tcW w:w="1760" w:type="dxa"/>
                             <w:tcBorders>
-                              <w:top w:val="single" w:sz="8" w:space="0" w:color="000000"/>
+                              <w:top w:val="single" w:sz="4" w:space="0" w:color="auto"/>
                               <w:left w:val="single" w:sz="4" w:space="0" w:color="000000"/>
                               <w:bottom w:val="single" w:sz="4" w:space="0" w:color="000000"/>
-                              <w:right w:val="single" w:sz="8" w:space="0" w:color="000000"/>
+                              <w:right w:val="single" w:sz="4" w:space="0" w:color="auto"/>
                             </w:tcBorders>
                             <w:vAlign w:val="center"/>
                           </w:tcPr>
@@ -5147,7 +5152,7 @@
                               <w:top w:val="single" w:sz="4" w:space="0" w:color="000000"/>
                               <w:left w:val="single" w:sz="4" w:space="0" w:color="000000"/>
                               <w:bottom w:val="single" w:sz="4" w:space="0" w:color="000000"/>
-                              <w:right w:val="single" w:sz="8" w:space="0" w:color="000000"/>
+                              <w:right w:val="single" w:sz="4" w:space="0" w:color="auto"/>
                             </w:tcBorders>
                             <w:vAlign w:val="center"/>
                           </w:tcPr>
@@ -5172,6 +5177,9 @@
                           <w:tcPr>
                             <w:tcW w:w="534" w:type="dxa"/>
                             <w:vMerge/>
+                            <w:tcBorders>
+                              <w:bottom w:val="single" w:sz="4" w:space="0" w:color="auto"/>
+                            </w:tcBorders>
                             <w:vAlign w:val="center"/>
                           </w:tcPr>
                           <w:p>
@@ -5186,7 +5194,7 @@
                             <w:tcBorders>
                               <w:top w:val="single" w:sz="4" w:space="0" w:color="000000"/>
                               <w:left w:val="single" w:sz="4" w:space="0" w:color="000000"/>
-                              <w:bottom w:val="single" w:sz="8" w:space="0" w:color="000000"/>
+                              <w:bottom w:val="single" w:sz="4" w:space="0" w:color="auto"/>
                               <w:right w:val="single" w:sz="4" w:space="0" w:color="000000"/>
                             </w:tcBorders>
                             <w:vAlign w:val="center"/>
@@ -5219,7 +5227,7 @@
                             <w:tcBorders>
                               <w:top w:val="single" w:sz="4" w:space="0" w:color="000000"/>
                               <w:left w:val="single" w:sz="4" w:space="0" w:color="000000"/>
-                              <w:bottom w:val="single" w:sz="8" w:space="0" w:color="000000"/>
+                              <w:bottom w:val="single" w:sz="4" w:space="0" w:color="auto"/>
                               <w:right w:val="single" w:sz="4" w:space="0" w:color="000000"/>
                             </w:tcBorders>
                             <w:vAlign w:val="center"/>
@@ -5242,8 +5250,8 @@
                             <w:tcBorders>
                               <w:top w:val="single" w:sz="4" w:space="0" w:color="000000"/>
                               <w:left w:val="single" w:sz="4" w:space="0" w:color="000000"/>
-                              <w:bottom w:val="single" w:sz="8" w:space="0" w:color="000000"/>
-                              <w:right w:val="single" w:sz="8" w:space="0" w:color="000000"/>
+                              <w:bottom w:val="single" w:sz="4" w:space="0" w:color="auto"/>
+                              <w:right w:val="single" w:sz="4" w:space="0" w:color="auto"/>
                             </w:tcBorders>
                             <w:vAlign w:val="center"/>
                           </w:tcPr>
@@ -5356,6 +5364,8 @@
                           <w:sz w:val="32"/>
                         </w:rPr>
                       </w:pPr>
+                      <w:bookmarkStart w:id="1" w:name="_GoBack"/>
+                      <w:bookmarkEnd w:id="1"/>
                     </w:p>
                     <w:p>
                       <w:pPr>
@@ -5817,8 +5827,6 @@
               </w:rPr>
               <w:t>管理番号</w:t>
             </w:r>
-            <w:bookmarkStart w:id="0" w:name="_GoBack"/>
-            <w:bookmarkEnd w:id="0"/>
             <w:r>
               <w:rPr>
                 <w:rFonts w:ascii="MS Gothic" w:eastAsia="MS Gothic" w:hAnsi="MS Gothic" w:hint="eastAsia"/>
@@ -7273,11 +7281,14 @@
             </w:pPr>
             <w:r>
               <w:rPr>
-                <w:rFonts w:ascii="MS Gothic" w:eastAsia="MS Gothic" w:hAnsi="MS Gothic"/>
-                <w:b/>
-                <w:sz w:val="24"/>
-              </w:rPr>
-              <w:t>金型</w:t>
+                <w:rFonts w:ascii="MS Gothic" w:eastAsia="MS Gothic" w:hAnsi="MS Gothic" w:cs="굴림" w:hint="eastAsia"/>
+                <w:b/>
+                <w:color w:val="000000"/>
+                <w:sz w:val="24"/>
+                <w:szCs w:val="24"/>
+                <w:lang w:eastAsia="ko-KR"/>
+              </w:rPr>
+              <w:t>金型価</w:t>
             </w:r>
           </w:p>
         </w:tc>
@@ -10451,7 +10462,7 @@
 </file>
 
 <file path=customXml/itemProps1.xml><?xml version="1.0" encoding="utf-8"?>
-<ds:datastoreItem xmlns:ds="http://schemas.openxmlformats.org/officeDocument/2006/customXml" ds:itemID="{73D3399C-E589-4EC6-9011-DAB86B9C144A}">
+<ds:datastoreItem xmlns:ds="http://schemas.openxmlformats.org/officeDocument/2006/customXml" ds:itemID="{4B9252B3-1978-4481-8714-ECC654FC2BDA}">
   <ds:schemaRefs>
     <ds:schemaRef ds:uri="http://schemas.openxmlformats.org/officeDocument/2006/bibliography"/>
   </ds:schemaRefs>

</xml_diff>